<commit_message>
fix: engagement letter template - convert p/tr prefix tags to plain Jinja2 for correct docxtpl rendering
- Replace all {%p if/endif %} and {%tr for/endfor %} tags with plain {% %} equivalents
  in the engagement letter .docx template to fix 'unknown tag endif/endfor' errors
- Add show_client_portal, client_portal_url, show_fusesign keys to DCB engagement letter context
- All 4 entity types (Trust, Company, Partnership, Sole Trader) now render correctly
</commit_message>
<xml_diff>
--- a/core/management/commands/Engagement_Letter_TEMPLATE_BW_v2.docx
+++ b/core/management/commands/Engagement_Letter_TEMPLATE_BW_v2.docx
@@ -468,7 +468,7 @@
           <w:sz w:val="16"/>
           <w:szCs w:val="16"/>
         </w:rPr>
-        <w:t xml:space="preserve">{%p if prior_year_letter_existed %}</w:t>
+        <w:t xml:space="preserve">{% if prior_year_letter_existed %}</w:t>
       </w:r>
       <w:r>
         <w:rPr>
@@ -486,7 +486,7 @@
           <w:sz w:val="16"/>
           <w:szCs w:val="16"/>
         </w:rPr>
-        <w:t xml:space="preserve">{%p endif %}</w:t>
+        <w:t xml:space="preserve">{% endif %}</w:t>
       </w:r>
     </w:p>
     <w:p>
@@ -500,7 +500,7 @@
           <w:sz w:val="16"/>
           <w:szCs w:val="16"/>
         </w:rPr>
-        <w:t xml:space="preserve">{%p if not prior_year_letter_existed %}</w:t>
+        <w:t xml:space="preserve">{% if not prior_year_letter_existed %}</w:t>
       </w:r>
       <w:r>
         <w:rPr>
@@ -538,7 +538,7 @@
           <w:sz w:val="16"/>
           <w:szCs w:val="16"/>
         </w:rPr>
-        <w:t xml:space="preserve">{%p endif %}</w:t>
+        <w:t xml:space="preserve">{% endif %}</w:t>
       </w:r>
     </w:p>
     <w:p>
@@ -729,7 +729,7 @@
                 <w:sz w:val="15"/>
                 <w:szCs w:val="15"/>
               </w:rPr>
-              <w:t xml:space="preserve">{%tr if show_service_compilation %}</w:t>
+              <w:t xml:space="preserve">{% if show_service_compilation %}</w:t>
             </w:r>
           </w:p>
         </w:tc>
@@ -826,7 +826,7 @@
                 <w:sz w:val="15"/>
                 <w:szCs w:val="15"/>
               </w:rPr>
-              <w:t xml:space="preserve">{%tr endif %}</w:t>
+              <w:t xml:space="preserve">{% endif %}</w:t>
             </w:r>
           </w:p>
         </w:tc>
@@ -923,7 +923,7 @@
                 <w:sz w:val="15"/>
                 <w:szCs w:val="15"/>
               </w:rPr>
-              <w:t xml:space="preserve">{%tr if show_service_tax_return %}</w:t>
+              <w:t xml:space="preserve">{% if show_service_tax_return %}</w:t>
             </w:r>
           </w:p>
         </w:tc>
@@ -1020,7 +1020,7 @@
                 <w:sz w:val="15"/>
                 <w:szCs w:val="15"/>
               </w:rPr>
-              <w:t xml:space="preserve">{%tr endif %}</w:t>
+              <w:t xml:space="preserve">{% endif %}</w:t>
             </w:r>
           </w:p>
         </w:tc>
@@ -1117,7 +1117,7 @@
                 <w:sz w:val="15"/>
                 <w:szCs w:val="15"/>
               </w:rPr>
-              <w:t xml:space="preserve">{%tr if show_service_bas %}</w:t>
+              <w:t xml:space="preserve">{% if show_service_bas %}</w:t>
             </w:r>
           </w:p>
         </w:tc>
@@ -1214,7 +1214,7 @@
                 <w:sz w:val="15"/>
                 <w:szCs w:val="15"/>
               </w:rPr>
-              <w:t xml:space="preserve">{%tr endif %}</w:t>
+              <w:t xml:space="preserve">{% endif %}</w:t>
             </w:r>
           </w:p>
         </w:tc>
@@ -1311,7 +1311,7 @@
                 <w:sz w:val="15"/>
                 <w:szCs w:val="15"/>
               </w:rPr>
-              <w:t xml:space="preserve">{%tr if show_service_asic %}</w:t>
+              <w:t xml:space="preserve">{% if show_service_asic %}</w:t>
             </w:r>
           </w:p>
         </w:tc>
@@ -1408,7 +1408,7 @@
                 <w:sz w:val="15"/>
                 <w:szCs w:val="15"/>
               </w:rPr>
-              <w:t xml:space="preserve">{%tr endif %}</w:t>
+              <w:t xml:space="preserve">{% endif %}</w:t>
             </w:r>
           </w:p>
         </w:tc>
@@ -1505,7 +1505,7 @@
                 <w:sz w:val="15"/>
                 <w:szCs w:val="15"/>
               </w:rPr>
-              <w:t xml:space="preserve">{%tr if show_service_trust_distribution %}</w:t>
+              <w:t xml:space="preserve">{% if show_service_trust_distribution %}</w:t>
             </w:r>
           </w:p>
         </w:tc>
@@ -1602,7 +1602,7 @@
                 <w:sz w:val="15"/>
                 <w:szCs w:val="15"/>
               </w:rPr>
-              <w:t xml:space="preserve">{%tr endif %}</w:t>
+              <w:t xml:space="preserve">{% endif %}</w:t>
             </w:r>
           </w:p>
         </w:tc>
@@ -1699,7 +1699,7 @@
                 <w:sz w:val="15"/>
                 <w:szCs w:val="15"/>
               </w:rPr>
-              <w:t xml:space="preserve">{%tr if show_service_div7a %}</w:t>
+              <w:t xml:space="preserve">{% if show_service_div7a %}</w:t>
             </w:r>
           </w:p>
         </w:tc>
@@ -1796,7 +1796,7 @@
                 <w:sz w:val="15"/>
                 <w:szCs w:val="15"/>
               </w:rPr>
-              <w:t xml:space="preserve">{%tr endif %}</w:t>
+              <w:t xml:space="preserve">{% endif %}</w:t>
             </w:r>
           </w:p>
         </w:tc>
@@ -1893,7 +1893,7 @@
                 <w:sz w:val="15"/>
                 <w:szCs w:val="15"/>
               </w:rPr>
-              <w:t xml:space="preserve">{%tr if show_service_fbt %}</w:t>
+              <w:t xml:space="preserve">{% if show_service_fbt %}</w:t>
             </w:r>
           </w:p>
         </w:tc>
@@ -1990,7 +1990,7 @@
                 <w:sz w:val="15"/>
                 <w:szCs w:val="15"/>
               </w:rPr>
-              <w:t xml:space="preserve">{%tr endif %}</w:t>
+              <w:t xml:space="preserve">{% endif %}</w:t>
             </w:r>
           </w:p>
         </w:tc>
@@ -2087,7 +2087,7 @@
                 <w:sz w:val="15"/>
                 <w:szCs w:val="15"/>
               </w:rPr>
-              <w:t xml:space="preserve">{%tr if show_service_tpar %}</w:t>
+              <w:t xml:space="preserve">{% if show_service_tpar %}</w:t>
             </w:r>
           </w:p>
         </w:tc>
@@ -2184,7 +2184,7 @@
                 <w:sz w:val="15"/>
                 <w:szCs w:val="15"/>
               </w:rPr>
-              <w:t xml:space="preserve">{%tr endif %}</w:t>
+              <w:t xml:space="preserve">{% endif %}</w:t>
             </w:r>
           </w:p>
         </w:tc>
@@ -2281,7 +2281,7 @@
                 <w:sz w:val="15"/>
                 <w:szCs w:val="15"/>
               </w:rPr>
-              <w:t xml:space="preserve">{%tr if show_service_payroll_tax %}</w:t>
+              <w:t xml:space="preserve">{% if show_service_payroll_tax %}</w:t>
             </w:r>
           </w:p>
         </w:tc>
@@ -2378,7 +2378,7 @@
                 <w:sz w:val="15"/>
                 <w:szCs w:val="15"/>
               </w:rPr>
-              <w:t xml:space="preserve">{%tr endif %}</w:t>
+              <w:t xml:space="preserve">{% endif %}</w:t>
             </w:r>
           </w:p>
         </w:tc>
@@ -2500,7 +2500,7 @@
           <w:sz w:val="16"/>
           <w:szCs w:val="16"/>
         </w:rPr>
-        <w:t xml:space="preserve">{%p if show_fixed_fee_clause %}</w:t>
+        <w:t xml:space="preserve">{% if show_fixed_fee_clause %}</w:t>
       </w:r>
     </w:p>
     <w:p>
@@ -2548,7 +2548,7 @@
           <w:sz w:val="16"/>
           <w:szCs w:val="16"/>
         </w:rPr>
-        <w:t xml:space="preserve">{%p endif %}</w:t>
+        <w:t xml:space="preserve">{% endif %}</w:t>
       </w:r>
     </w:p>
     <w:p>
@@ -2562,7 +2562,7 @@
           <w:sz w:val="16"/>
           <w:szCs w:val="16"/>
         </w:rPr>
-        <w:t xml:space="preserve">{%p if show_hourly_clause %}</w:t>
+        <w:t xml:space="preserve">{% if show_hourly_clause %}</w:t>
       </w:r>
     </w:p>
     <w:p>
@@ -2610,7 +2610,7 @@
           <w:sz w:val="16"/>
           <w:szCs w:val="16"/>
         </w:rPr>
-        <w:t xml:space="preserve">{%p endif %}</w:t>
+        <w:t xml:space="preserve">{% endif %}</w:t>
       </w:r>
     </w:p>
     <w:p>
@@ -2624,7 +2624,7 @@
           <w:sz w:val="16"/>
           <w:szCs w:val="16"/>
         </w:rPr>
-        <w:t xml:space="preserve">{%p if show_estimate_clause %}</w:t>
+        <w:t xml:space="preserve">{% if show_estimate_clause %}</w:t>
       </w:r>
     </w:p>
     <w:p>
@@ -2672,7 +2672,7 @@
           <w:sz w:val="16"/>
           <w:szCs w:val="16"/>
         </w:rPr>
-        <w:t xml:space="preserve">{%p endif %}</w:t>
+        <w:t xml:space="preserve">{% endif %}</w:t>
       </w:r>
     </w:p>
     <w:p>
@@ -3011,7 +3011,7 @@
           <w:sz w:val="16"/>
           <w:szCs w:val="16"/>
         </w:rPr>
-        <w:t xml:space="preserve">{%p if show_service_compilation %}</w:t>
+        <w:t xml:space="preserve">{% if show_service_compilation %}</w:t>
       </w:r>
     </w:p>
     <w:p>
@@ -3182,7 +3182,7 @@
           <w:sz w:val="16"/>
           <w:szCs w:val="16"/>
         </w:rPr>
-        <w:t xml:space="preserve">{%p endif %}</w:t>
+        <w:t xml:space="preserve">{% endif %}</w:t>
       </w:r>
     </w:p>
     <w:p>
@@ -3196,7 +3196,7 @@
           <w:sz w:val="16"/>
           <w:szCs w:val="16"/>
         </w:rPr>
-        <w:t xml:space="preserve">{%p if show_service_div7a %}</w:t>
+        <w:t xml:space="preserve">{% if show_service_div7a %}</w:t>
       </w:r>
     </w:p>
     <w:p>
@@ -3291,7 +3291,7 @@
           <w:sz w:val="16"/>
           <w:szCs w:val="16"/>
         </w:rPr>
-        <w:t xml:space="preserve">{%p endif %}</w:t>
+        <w:t xml:space="preserve">{% endif %}</w:t>
       </w:r>
     </w:p>
     <w:p>
@@ -3305,7 +3305,7 @@
           <w:sz w:val="16"/>
           <w:szCs w:val="16"/>
         </w:rPr>
-        <w:t xml:space="preserve">{%p if show_service_trust_distribution %}</w:t>
+        <w:t xml:space="preserve">{% if show_service_trust_distribution %}</w:t>
       </w:r>
     </w:p>
     <w:p>
@@ -3380,7 +3380,7 @@
           <w:sz w:val="16"/>
           <w:szCs w:val="16"/>
         </w:rPr>
-        <w:t xml:space="preserve">{%p endif %}</w:t>
+        <w:t xml:space="preserve">{% endif %}</w:t>
       </w:r>
     </w:p>
     <w:p>
@@ -3643,7 +3643,7 @@
           <w:sz w:val="16"/>
           <w:szCs w:val="16"/>
         </w:rPr>
-        <w:t xml:space="preserve">{%p if show_client_portal %}</w:t>
+        <w:t xml:space="preserve">{% if show_client_portal %}</w:t>
       </w:r>
     </w:p>
     <w:p>
@@ -3702,7 +3702,7 @@
           <w:sz w:val="16"/>
           <w:szCs w:val="16"/>
         </w:rPr>
-        <w:t xml:space="preserve">{%p endif %}</w:t>
+        <w:t xml:space="preserve">{% endif %}</w:t>
       </w:r>
     </w:p>
     <w:p>
@@ -3716,7 +3716,7 @@
           <w:sz w:val="16"/>
           <w:szCs w:val="16"/>
         </w:rPr>
-        <w:t xml:space="preserve">{%p if show_fusesign %}</w:t>
+        <w:t xml:space="preserve">{% if show_fusesign %}</w:t>
       </w:r>
     </w:p>
     <w:p>
@@ -3775,7 +3775,7 @@
           <w:sz w:val="16"/>
           <w:szCs w:val="16"/>
         </w:rPr>
-        <w:t xml:space="preserve">{%p endif %}</w:t>
+        <w:t xml:space="preserve">{% endif %}</w:t>
       </w:r>
     </w:p>
     <w:p>
@@ -4021,7 +4021,7 @@
           <w:sz w:val="16"/>
           <w:szCs w:val="16"/>
         </w:rPr>
-        <w:t xml:space="preserve">{%p if show_additional_terms %}</w:t>
+        <w:t xml:space="preserve">{% if show_additional_terms %}</w:t>
       </w:r>
     </w:p>
     <w:p>
@@ -4070,7 +4070,7 @@
           <w:sz w:val="16"/>
           <w:szCs w:val="16"/>
         </w:rPr>
-        <w:t xml:space="preserve">{%p endif %}</w:t>
+        <w:t xml:space="preserve">{% endif %}</w:t>
       </w:r>
     </w:p>
     <w:p>
@@ -4448,7 +4448,7 @@
           <w:sz w:val="16"/>
           <w:szCs w:val="16"/>
         </w:rPr>
-        <w:t xml:space="preserve">{%p if is_company %}</w:t>
+        <w:t xml:space="preserve">{% if is_company %}</w:t>
       </w:r>
     </w:p>
     <w:p>
@@ -4629,7 +4629,7 @@
           <w:sz w:val="20"/>
           <w:szCs w:val="20"/>
         </w:rPr>
-        <w:t xml:space="preserve">{%tr for director in signing_directors %}</w:t>
+        <w:t xml:space="preserve">{% for director in signing_directors %}</w:t>
       </w:r>
     </w:p>
     <w:p>
@@ -4672,7 +4672,7 @@
           <w:sz w:val="20"/>
           <w:szCs w:val="20"/>
         </w:rPr>
-        <w:t xml:space="preserve">{%tr endfor %}</w:t>
+        <w:t xml:space="preserve">{% endfor %}</w:t>
       </w:r>
     </w:p>
     <w:p>
@@ -4686,7 +4686,7 @@
           <w:sz w:val="16"/>
           <w:szCs w:val="16"/>
         </w:rPr>
-        <w:t xml:space="preserve">{%p endif %}</w:t>
+        <w:t xml:space="preserve">{% endif %}</w:t>
       </w:r>
     </w:p>
     <w:p>
@@ -4700,7 +4700,7 @@
           <w:sz w:val="16"/>
           <w:szCs w:val="16"/>
         </w:rPr>
-        <w:t xml:space="preserve">{%p if is_trust %}</w:t>
+        <w:t xml:space="preserve">{% if is_trust %}</w:t>
       </w:r>
     </w:p>
     <w:p>
@@ -4881,7 +4881,7 @@
           <w:sz w:val="20"/>
           <w:szCs w:val="20"/>
         </w:rPr>
-        <w:t xml:space="preserve">{%tr for trustee in trustees %}</w:t>
+        <w:t xml:space="preserve">{% for trustee in trustees %}</w:t>
       </w:r>
     </w:p>
     <w:p>
@@ -4924,7 +4924,7 @@
           <w:sz w:val="20"/>
           <w:szCs w:val="20"/>
         </w:rPr>
-        <w:t xml:space="preserve">{%tr endfor %}</w:t>
+        <w:t xml:space="preserve">{% endfor %}</w:t>
       </w:r>
     </w:p>
     <w:p>
@@ -4938,7 +4938,7 @@
           <w:sz w:val="16"/>
           <w:szCs w:val="16"/>
         </w:rPr>
-        <w:t xml:space="preserve">{%p endif %}</w:t>
+        <w:t xml:space="preserve">{% endif %}</w:t>
       </w:r>
     </w:p>
     <w:p>
@@ -4952,7 +4952,7 @@
           <w:sz w:val="16"/>
           <w:szCs w:val="16"/>
         </w:rPr>
-        <w:t xml:space="preserve">{%p if is_partnership %}</w:t>
+        <w:t xml:space="preserve">{% if is_partnership %}</w:t>
       </w:r>
     </w:p>
     <w:p>
@@ -4992,7 +4992,7 @@
           <w:sz w:val="20"/>
           <w:szCs w:val="20"/>
         </w:rPr>
-        <w:t xml:space="preserve">{%tr for partner in partners %}</w:t>
+        <w:t xml:space="preserve">{% for partner in partners %}</w:t>
       </w:r>
     </w:p>
     <w:tbl>
@@ -5149,7 +5149,7 @@
           <w:sz w:val="20"/>
           <w:szCs w:val="20"/>
         </w:rPr>
-        <w:t xml:space="preserve">{%tr endfor %}</w:t>
+        <w:t xml:space="preserve">{% endfor %}</w:t>
       </w:r>
     </w:p>
     <w:p>
@@ -5163,7 +5163,7 @@
           <w:sz w:val="16"/>
           <w:szCs w:val="16"/>
         </w:rPr>
-        <w:t xml:space="preserve">{%p endif %}</w:t>
+        <w:t xml:space="preserve">{% endif %}</w:t>
       </w:r>
     </w:p>
     <w:p>

</xml_diff>